<commit_message>
Atualizar link navegavel da atividade
</commit_message>
<xml_diff>
--- a/docs/atividade_prototipacao_logicash.docx
+++ b/docs/atividade_prototipacao_logicash.docx
@@ -912,16 +912,28 @@
     </w:p>
     <w:p>
       <w:pPr>
-        <w:spacing w:after="220" w:line="259" w:lineRule="auto"/>
+        <w:spacing w:after="40" w:line="259" w:lineRule="auto"/>
+        <w:jc w:val="left"/>
       </w:pPr>
       <w:r>
         <w:rPr>
-          <w:rFonts w:ascii="Arial" w:hAnsi="Arial"/>
-          <w:b w:val="0"/>
-          <w:color w:val="1E293B"/>
+          <w:rFonts w:ascii="Calibri" w:hAnsi="Calibri"/>
           <w:sz w:val="21"/>
         </w:rPr>
-        <w:t>Arquivo navegável em HTML/CSS/JavaScript puro: logicash_prototipo_mobile_v2_corrigido.html. O arquivo abre diretamente no navegador, sem backend e sem dependência de internet. Para publicação no GitHub Pages, basta enviar o HTML e a pasta de telas para o repositório definido.</w:t>
+        <w:t>Protótipo navegável: https://gabrielcarris.github.io/logicash-prototipo-mobile/</w:t>
+      </w:r>
+    </w:p>
+    <w:p>
+      <w:pPr>
+        <w:spacing w:before="0" w:after="0"/>
+        <w:jc w:val="left"/>
+      </w:pPr>
+      <w:r>
+        <w:rPr>
+          <w:rFonts w:ascii="Calibri" w:hAnsi="Calibri"/>
+          <w:sz w:val="21"/>
+        </w:rPr>
+        <w:t>Repositório GitHub com telas e documento: https://github.com/gabrielcarris/logicash-prototipo-mobile</w:t>
       </w:r>
     </w:p>
     <w:sectPr>

</xml_diff>